<commit_message>
Fix hide controls and rebalance demo
</commit_message>
<xml_diff>
--- a/รายงานโครงงานเกม 2D_เสพติดการโดดเรียน_Final.docx
+++ b/รายงานโครงงานเกม 2D_เสพติดการโดดเรียน_Final.docx
@@ -961,7 +961,7 @@
                 <w:color w:val="18233B"/>
                 <w:sz w:val="19"/>
               </w:rPr>
-              <w:t>กระโดด</w:t>
+              <w:t>กระโดด / Double Jump (กดซ้ำ 2 ครั้ง)</w:t>
             </w:r>
           </w:p>
         </w:tc>
@@ -1007,7 +1007,7 @@
                 <w:color w:val="18233B"/>
                 <w:sz w:val="19"/>
               </w:rPr>
-              <w:t>ย่อ/ซ่อน</w:t>
+              <w:t>ย่อให้ถูกมองเห็นยากขึ้น</w:t>
             </w:r>
           </w:p>
         </w:tc>

</xml_diff>

<commit_message>
Fix hide controls and rebalance demo (#1)
</commit_message>
<xml_diff>
--- a/รายงานโครงงานเกม 2D_เสพติดการโดดเรียน_Final.docx
+++ b/รายงานโครงงานเกม 2D_เสพติดการโดดเรียน_Final.docx
@@ -961,7 +961,7 @@
                 <w:color w:val="18233B"/>
                 <w:sz w:val="19"/>
               </w:rPr>
-              <w:t>กระโดด</w:t>
+              <w:t>กระโดด / Double Jump (กดซ้ำ 2 ครั้ง)</w:t>
             </w:r>
           </w:p>
         </w:tc>
@@ -1007,7 +1007,7 @@
                 <w:color w:val="18233B"/>
                 <w:sz w:val="19"/>
               </w:rPr>
-              <w:t>ย่อ/ซ่อน</w:t>
+              <w:t>ย่อให้ถูกมองเห็นยากขึ้น</w:t>
             </w:r>
           </w:p>
         </w:tc>

</xml_diff>